<commit_message>
context: update conversation context 2026-09-11
</commit_message>
<xml_diff>
--- a/projects/qube-agency/qube-onepager.docx
+++ b/projects/qube-agency/qube-onepager.docx
@@ -4,7 +4,7 @@
   <w:body>
     <w:p>
       <w:pPr>
-        <w:spacing w:before="0" w:after="0"/>
+        <w:spacing w:before="0" w:after="40"/>
       </w:pPr>
       <w:r>
         <w:rPr>
@@ -12,14 +12,14 @@
           <w:b/>
           <w:i w:val="0"/>
           <w:color w:val="FF7A2F"/>
-          <w:sz w:val="56"/>
+          <w:sz w:val="60"/>
         </w:rPr>
         <w:t>QUBE</w:t>
       </w:r>
     </w:p>
     <w:p>
       <w:pPr>
-        <w:spacing w:before="40" w:after="200"/>
+        <w:spacing w:before="0" w:after="280"/>
       </w:pPr>
       <w:r>
         <w:rPr>
@@ -29,22 +29,22 @@
           <w:color w:val="505A6E"/>
           <w:sz w:val="26"/>
         </w:rPr>
-        <w:t>India's Physical AI Data Company</w:t>
+        <w:t>India's physical AI data collection company</w:t>
       </w:r>
     </w:p>
     <w:p>
       <w:pPr>
         <w:spacing w:before="0" w:after="0"/>
         <w:pBdr>
-          <w:bottom w:val="single" w:sz="6" w:space="1" w:color="FF7A2F"/>
+          <w:bottom w:val="single" w:sz="8" w:space="1" w:color="FF7A2F"/>
         </w:pBdr>
       </w:pPr>
     </w:p>
     <w:p>
       <w:pPr>
-        <w:spacing w:before="280" w:after="60"/>
+        <w:spacing w:before="320" w:after="80"/>
         <w:pBdr>
-          <w:bottom w:val="single" w:sz="4" w:space="1" w:color="E0E4EE"/>
+          <w:bottom w:val="single" w:sz="4" w:space="1" w:color="FFD4B0"/>
         </w:pBdr>
       </w:pPr>
       <w:r>
@@ -60,7 +60,7 @@
     </w:p>
     <w:p>
       <w:pPr>
-        <w:spacing w:after="120"/>
+        <w:spacing w:after="200"/>
       </w:pPr>
       <w:r>
         <w:rPr>
@@ -70,13 +70,333 @@
           <w:color w:val="1E232D"/>
           <w:sz w:val="21"/>
         </w:rPr>
-        <w:t>Qube collects and annotates egocentric training data for robotics and embodied AI companies. We run an in-house execution team in India with factory floor access across manufacturing verticals -- auto components, electronics assembly, and pharma packaging.</w:t>
+        <w:t>Qube collects and annotates egocentric (first-person POV) training data for robotics and embodied AI companies -- specifically from Indian manufacturing environments. We combine factory floor access, a professional in-house execution team, and a structured QA pipeline to produce consent-clean, task-specific datasets that AI labs can train on directly.</w:t>
+      </w:r>
+    </w:p>
+    <w:p>
+      <w:pPr>
+        <w:spacing w:before="320" w:after="80"/>
+        <w:pBdr>
+          <w:bottom w:val="single" w:sz="4" w:space="1" w:color="FFD4B0"/>
+        </w:pBdr>
+      </w:pPr>
+      <w:r>
+        <w:rPr>
+          <w:rFonts w:ascii="Calibri" w:hAnsi="Calibri"/>
+          <w:b/>
+          <w:i w:val="0"/>
+          <w:color w:val="FF7A2F"/>
+          <w:sz w:val="17"/>
+        </w:rPr>
+        <w:t>THE GAP WE FILL</w:t>
+      </w:r>
+    </w:p>
+    <w:tbl>
+      <w:tblPr>
+        <w:tblStyle w:val="TableGrid"/>
+        <w:tblW w:type="auto" w:w="0"/>
+        <w:jc w:val="left"/>
+        <w:tblLook w:firstColumn="1" w:firstRow="1" w:lastColumn="0" w:lastRow="0" w:noHBand="0" w:noVBand="1" w:val="04A0"/>
+      </w:tblPr>
+      <w:tblGrid>
+        <w:gridCol w:w="4703"/>
+        <w:gridCol w:w="4703"/>
+      </w:tblGrid>
+      <w:tr>
+        <w:tc>
+          <w:tcPr>
+            <w:tcW w:type="dxa" w:w="3600"/>
+            <w:shd w:val="clear" w:color="auto" w:fill="FFF4EE"/>
+          </w:tcPr>
+          <w:p>
+            <w:r>
+              <w:rPr>
+                <w:rFonts w:ascii="Calibri" w:hAnsi="Calibri"/>
+                <w:b/>
+                <w:i w:val="0"/>
+                <w:color w:val="A05014"/>
+                <w:sz w:val="20"/>
+              </w:rPr>
+              <w:t>No India-specific manufacturing data at scale</w:t>
+            </w:r>
+          </w:p>
+        </w:tc>
+        <w:tc>
+          <w:tcPr>
+            <w:tcW w:type="dxa" w:w="5760"/>
+            <w:shd w:val="clear" w:color="auto" w:fill="FFF4EE"/>
+          </w:tcPr>
+          <w:p>
+            <w:r>
+              <w:rPr>
+                <w:rFonts w:ascii="Calibri" w:hAnsi="Calibri"/>
+                <w:b w:val="0"/>
+                <w:i w:val="0"/>
+                <w:color w:val="282828"/>
+                <w:sz w:val="20"/>
+              </w:rPr>
+              <w:t>Indian factory floors are the deployment target for the next wave of industrial robots. No company is collecting from these environments at commercial scale.</w:t>
+            </w:r>
+          </w:p>
+        </w:tc>
+      </w:tr>
+      <w:tr>
+        <w:tc>
+          <w:tcPr>
+            <w:tcW w:type="dxa" w:w="3600"/>
+            <w:shd w:val="clear" w:color="auto" w:fill="FFFFFF"/>
+          </w:tcPr>
+          <w:p>
+            <w:r>
+              <w:rPr>
+                <w:rFonts w:ascii="Calibri" w:hAnsi="Calibri"/>
+                <w:b/>
+                <w:i w:val="0"/>
+                <w:color w:val="A05014"/>
+                <w:sz w:val="20"/>
+              </w:rPr>
+              <w:t>Generic egocentric data is commoditised</w:t>
+            </w:r>
+          </w:p>
+        </w:tc>
+        <w:tc>
+          <w:tcPr>
+            <w:tcW w:type="dxa" w:w="5760"/>
+            <w:shd w:val="clear" w:color="auto" w:fill="FFFFFF"/>
+          </w:tcPr>
+          <w:p>
+            <w:r>
+              <w:rPr>
+                <w:rFonts w:ascii="Calibri" w:hAnsi="Calibri"/>
+                <w:b w:val="0"/>
+                <w:i w:val="0"/>
+                <w:color w:val="282828"/>
+                <w:sz w:val="20"/>
+              </w:rPr>
+              <w:t>Build AI and others have released millions of hours of household footage for free. What labs actually pay for is task-specific, environment-specific, annotated data.</w:t>
+            </w:r>
+          </w:p>
+        </w:tc>
+      </w:tr>
+      <w:tr>
+        <w:tc>
+          <w:tcPr>
+            <w:tcW w:type="dxa" w:w="3600"/>
+            <w:shd w:val="clear" w:color="auto" w:fill="FFF4EE"/>
+          </w:tcPr>
+          <w:p>
+            <w:r>
+              <w:rPr>
+                <w:rFonts w:ascii="Calibri" w:hAnsi="Calibri"/>
+                <w:b/>
+                <w:i w:val="0"/>
+                <w:color w:val="A05014"/>
+                <w:sz w:val="20"/>
+              </w:rPr>
+              <w:t>Existing agencies lack India ground execution</w:t>
+            </w:r>
+          </w:p>
+        </w:tc>
+        <w:tc>
+          <w:tcPr>
+            <w:tcW w:type="dxa" w:w="5760"/>
+            <w:shd w:val="clear" w:color="auto" w:fill="FFF4EE"/>
+          </w:tcPr>
+          <w:p>
+            <w:r>
+              <w:rPr>
+                <w:rFonts w:ascii="Calibri" w:hAnsi="Calibri"/>
+                <w:b w:val="0"/>
+                <w:i w:val="0"/>
+                <w:color w:val="282828"/>
+                <w:sz w:val="20"/>
+              </w:rPr>
+              <w:t>Tier 1 agencies (Cloudfactory, iMerit, Cogito) have no reliable India physical AI collection capability. They sub it out or turn it down.</w:t>
+            </w:r>
+          </w:p>
+        </w:tc>
+      </w:tr>
+    </w:tbl>
+    <w:p>
+      <w:pPr>
+        <w:spacing w:after="40"/>
+      </w:pPr>
+    </w:p>
+    <w:p>
+      <w:pPr>
+        <w:spacing w:before="320" w:after="80"/>
+        <w:pBdr>
+          <w:bottom w:val="single" w:sz="4" w:space="1" w:color="FFD4B0"/>
+        </w:pBdr>
+      </w:pPr>
+      <w:r>
+        <w:rPr>
+          <w:rFonts w:ascii="Calibri" w:hAnsi="Calibri"/>
+          <w:b/>
+          <w:i w:val="0"/>
+          <w:color w:val="FF7A2F"/>
+          <w:sz w:val="17"/>
+        </w:rPr>
+        <w:t>WHAT MAKES US DIFFERENT</w:t>
       </w:r>
     </w:p>
     <w:p>
       <w:pPr>
         <w:pStyle w:val="ListBullet"/>
-        <w:spacing w:before="20" w:after="20"/>
+        <w:spacing w:before="40" w:after="40"/>
+        <w:ind w:left="288"/>
+      </w:pPr>
+      <w:r>
+        <w:rPr>
+          <w:rFonts w:ascii="Calibri" w:hAnsi="Calibri"/>
+          <w:b/>
+          <w:i w:val="0"/>
+          <w:color w:val="1E232D"/>
+          <w:sz w:val="21"/>
+        </w:rPr>
+        <w:t>Factory floor access</w:t>
+      </w:r>
+      <w:r>
+        <w:rPr>
+          <w:rFonts w:ascii="Calibri" w:hAnsi="Calibri"/>
+          <w:b w:val="0"/>
+          <w:i w:val="0"/>
+          <w:color w:val="1E232D"/>
+          <w:sz w:val="21"/>
+        </w:rPr>
+        <w:t>-- direct relationships with manufacturing facilities across auto components, electronics assembly, and pharma packaging verticals in India.</w:t>
+      </w:r>
+    </w:p>
+    <w:p>
+      <w:pPr>
+        <w:pStyle w:val="ListBullet"/>
+        <w:spacing w:before="40" w:after="40"/>
+        <w:ind w:left="288"/>
+      </w:pPr>
+      <w:r>
+        <w:rPr>
+          <w:rFonts w:ascii="Calibri" w:hAnsi="Calibri"/>
+          <w:b/>
+          <w:i w:val="0"/>
+          <w:color w:val="1E232D"/>
+          <w:sz w:val="21"/>
+        </w:rPr>
+        <w:t>Consent-clean data</w:t>
+      </w:r>
+      <w:r>
+        <w:rPr>
+          <w:rFonts w:ascii="Calibri" w:hAnsi="Calibri"/>
+          <w:b w:val="0"/>
+          <w:i w:val="0"/>
+          <w:color w:val="1E232D"/>
+          <w:sz w:val="21"/>
+        </w:rPr>
+        <w:t>-- employer-level consent frameworks, not just individual sign-offs. Legally defensible for lab use.</w:t>
+      </w:r>
+    </w:p>
+    <w:p>
+      <w:pPr>
+        <w:pStyle w:val="ListBullet"/>
+        <w:spacing w:before="40" w:after="40"/>
+        <w:ind w:left="288"/>
+      </w:pPr>
+      <w:r>
+        <w:rPr>
+          <w:rFonts w:ascii="Calibri" w:hAnsi="Calibri"/>
+          <w:b/>
+          <w:i w:val="0"/>
+          <w:color w:val="1E232D"/>
+          <w:sz w:val="21"/>
+        </w:rPr>
+        <w:t>End-to-end QA pipeline</w:t>
+      </w:r>
+      <w:r>
+        <w:rPr>
+          <w:rFonts w:ascii="Calibri" w:hAnsi="Calibri"/>
+          <w:b w:val="0"/>
+          <w:i w:val="0"/>
+          <w:color w:val="1E232D"/>
+          <w:sz w:val="21"/>
+        </w:rPr>
+        <w:t>-- structured narration standards, hand visibility checks, PII review, and file validation before any batch is delivered.</w:t>
+      </w:r>
+    </w:p>
+    <w:p>
+      <w:pPr>
+        <w:pStyle w:val="ListBullet"/>
+        <w:spacing w:before="40" w:after="40"/>
+        <w:ind w:left="288"/>
+      </w:pPr>
+      <w:r>
+        <w:rPr>
+          <w:rFonts w:ascii="Calibri" w:hAnsi="Calibri"/>
+          <w:b/>
+          <w:i w:val="0"/>
+          <w:color w:val="1E232D"/>
+          <w:sz w:val="21"/>
+        </w:rPr>
+        <w:t>Annotation capability</w:t>
+      </w:r>
+      <w:r>
+        <w:rPr>
+          <w:rFonts w:ascii="Calibri" w:hAnsi="Calibri"/>
+          <w:b w:val="0"/>
+          <w:i w:val="0"/>
+          <w:color w:val="1E232D"/>
+          <w:sz w:val="21"/>
+        </w:rPr>
+        <w:t>-- temporal/action labels, object annotation, pose/keypoint, and task state labels. CVAT-based workflow.</w:t>
+      </w:r>
+    </w:p>
+    <w:p>
+      <w:pPr>
+        <w:pStyle w:val="ListBullet"/>
+        <w:spacing w:before="40" w:after="40"/>
+        <w:ind w:left="288"/>
+      </w:pPr>
+      <w:r>
+        <w:rPr>
+          <w:rFonts w:ascii="Calibri" w:hAnsi="Calibri"/>
+          <w:b/>
+          <w:i w:val="0"/>
+          <w:color w:val="1E232D"/>
+          <w:sz w:val="21"/>
+        </w:rPr>
+        <w:t>Task-specific collections</w:t>
+      </w:r>
+      <w:r>
+        <w:rPr>
+          <w:rFonts w:ascii="Calibri" w:hAnsi="Calibri"/>
+          <w:b w:val="0"/>
+          <w:i w:val="0"/>
+          <w:color w:val="1E232D"/>
+          <w:sz w:val="21"/>
+        </w:rPr>
+        <w:t>-- we design recordings around specific robot task demonstrations, not generic footage.</w:t>
+      </w:r>
+    </w:p>
+    <w:p>
+      <w:pPr>
+        <w:spacing w:before="320" w:after="80"/>
+        <w:pBdr>
+          <w:bottom w:val="single" w:sz="4" w:space="1" w:color="FFD4B0"/>
+        </w:pBdr>
+      </w:pPr>
+      <w:r>
+        <w:rPr>
+          <w:rFonts w:ascii="Calibri" w:hAnsi="Calibri"/>
+          <w:b/>
+          <w:i w:val="0"/>
+          <w:color w:val="FF7A2F"/>
+          <w:sz w:val="17"/>
+        </w:rPr>
+        <w:t>WHERE WE ARE</w:t>
+      </w:r>
+    </w:p>
+    <w:p>
+      <w:pPr>
+        <w:pStyle w:val="ListBullet"/>
+        <w:spacing w:before="40" w:after="40"/>
         <w:ind w:left="288"/>
       </w:pPr>
       <w:r>
@@ -87,13 +407,13 @@
           <w:color w:val="1E232D"/>
           <w:sz w:val="21"/>
         </w:rPr>
-        <w:t>Task-specific video collection from real manufacturing environments</w:t>
+        <w:t>Active egocentric data collection projects running in India</w:t>
       </w:r>
     </w:p>
     <w:p>
       <w:pPr>
         <w:pStyle w:val="ListBullet"/>
-        <w:spacing w:before="20" w:after="20"/>
+        <w:spacing w:before="40" w:after="40"/>
         <w:ind w:left="288"/>
       </w:pPr>
       <w:r>
@@ -104,13 +424,13 @@
           <w:color w:val="1E232D"/>
           <w:sz w:val="21"/>
         </w:rPr>
-        <w:t>Full annotation pipeline -- temporal labels, object masks, pose, task state</w:t>
+        <w:t>Agency partnerships in progress with Tier 1/2 data companies</w:t>
       </w:r>
     </w:p>
     <w:p>
       <w:pPr>
         <w:pStyle w:val="ListBullet"/>
-        <w:spacing w:before="20" w:after="20"/>
+        <w:spacing w:before="40" w:after="40"/>
         <w:ind w:left="288"/>
       </w:pPr>
       <w:r>
@@ -121,13 +441,13 @@
           <w:color w:val="1E232D"/>
           <w:sz w:val="21"/>
         </w:rPr>
-        <w:t>Consent-clean: employer-level consent frameworks, not just individual sign-offs</w:t>
+        <w:t>Manufacturing floor access across 3 verticals</w:t>
       </w:r>
     </w:p>
     <w:p>
       <w:pPr>
         <w:pStyle w:val="ListBullet"/>
-        <w:spacing w:before="20" w:after="20"/>
+        <w:spacing w:before="40" w:after="40"/>
         <w:ind w:left="288"/>
       </w:pPr>
       <w:r>
@@ -138,14 +458,14 @@
           <w:color w:val="1E232D"/>
           <w:sz w:val="21"/>
         </w:rPr>
-        <w:t>Fast execution: pilot-to-delivery in under 3 weeks</w:t>
+        <w:t>QA and annotation pipeline operational</w:t>
       </w:r>
     </w:p>
     <w:p>
       <w:pPr>
-        <w:spacing w:before="280" w:after="60"/>
+        <w:spacing w:before="320" w:after="80"/>
         <w:pBdr>
-          <w:bottom w:val="single" w:sz="4" w:space="1" w:color="E0E4EE"/>
+          <w:bottom w:val="single" w:sz="4" w:space="1" w:color="FFD4B0"/>
         </w:pBdr>
       </w:pPr>
       <w:r>
@@ -156,7 +476,7 @@
           <w:color w:val="FF7A2F"/>
           <w:sz w:val="17"/>
         </w:rPr>
-        <w:t>THE OPPORTUNITY</w:t>
+        <w:t>THE MARKET</w:t>
       </w:r>
     </w:p>
     <w:p>
@@ -171,7 +491,25 @@
           <w:color w:val="1E232D"/>
           <w:sz w:val="21"/>
         </w:rPr>
-        <w:t>Physical AI training data is a fast-growing market as humanoid robots and autonomous systems move from labs to real deployments. The gap: no company has cracked India-specific manufacturing data at commercial scale.</w:t>
+        <w:t>Physical AI training data is a fast-growing category driven by humanoid robotics, autonomous systems, and embodied AI. Indian manufacturing represents a $450B+ sector that is predominantly manual-labour intensive -- the exact workflows these robots are being trained to perform. Companies deploying in India or building generalised models need India-sourced data. Nobody is supplying it at professional quality.</w:t>
+      </w:r>
+    </w:p>
+    <w:p>
+      <w:pPr>
+        <w:spacing w:before="320" w:after="80"/>
+        <w:pBdr>
+          <w:bottom w:val="single" w:sz="4" w:space="1" w:color="FFD4B0"/>
+        </w:pBdr>
+      </w:pPr>
+      <w:r>
+        <w:rPr>
+          <w:rFonts w:ascii="Calibri" w:hAnsi="Calibri"/>
+          <w:b/>
+          <w:i w:val="0"/>
+          <w:color w:val="FF7A2F"/>
+          <w:sz w:val="17"/>
+        </w:rPr>
+        <w:t>WARM INTRODUCTIONS WE ARE LOOKING FOR</w:t>
       </w:r>
     </w:p>
     <w:tbl>
@@ -188,7 +526,7 @@
         <w:tc>
           <w:tcPr>
             <w:tcW w:type="dxa" w:w="4703"/>
-            <w:shd w:val="clear" w:color="auto" w:fill="FFF4EE"/>
+            <w:shd w:val="clear" w:color="auto" w:fill="F0F7FF"/>
           </w:tcPr>
           <w:p>
             <w:r>
@@ -196,17 +534,17 @@
                 <w:rFonts w:ascii="Calibri" w:hAnsi="Calibri"/>
                 <w:b/>
                 <w:i w:val="0"/>
-                <w:color w:val="503C28"/>
+                <w:color w:val="1E3C78"/>
                 <w:sz w:val="20"/>
               </w:rPr>
-              <w:t>Indian manufacturing GDP</w:t>
+              <w:t>Data agencies &amp; platforms</w:t>
             </w:r>
           </w:p>
         </w:tc>
         <w:tc>
           <w:tcPr>
             <w:tcW w:type="dxa" w:w="4703"/>
-            <w:shd w:val="clear" w:color="auto" w:fill="FFF4EE"/>
+            <w:shd w:val="clear" w:color="auto" w:fill="F0F7FF"/>
           </w:tcPr>
           <w:p>
             <w:r>
@@ -214,10 +552,10 @@
                 <w:rFonts w:ascii="Calibri" w:hAnsi="Calibri"/>
                 <w:b w:val="0"/>
                 <w:i w:val="0"/>
-                <w:color w:val="1E232D"/>
+                <w:color w:val="282828"/>
                 <w:sz w:val="20"/>
               </w:rPr>
-              <w:t>$450B+ and scaling under Make in India</w:t>
+              <w:t>Tier 1/2 agencies (Cloudfactory, iMerit, Cogito, Taskmonk) or data platforms actively sourcing physical AI or egocentric data -- especially if they have India gaps in their execution.</w:t>
             </w:r>
           </w:p>
         </w:tc>
@@ -234,10 +572,10 @@
                 <w:rFonts w:ascii="Calibri" w:hAnsi="Calibri"/>
                 <w:b/>
                 <w:i w:val="0"/>
-                <w:color w:val="503C28"/>
+                <w:color w:val="1E3C78"/>
                 <w:sz w:val="20"/>
               </w:rPr>
-              <w:t>Why India data specifically</w:t>
+              <w:t>Robotics &amp; embodied AI labs</w:t>
             </w:r>
           </w:p>
         </w:tc>
@@ -252,10 +590,10 @@
                 <w:rFonts w:ascii="Calibri" w:hAnsi="Calibri"/>
                 <w:b w:val="0"/>
                 <w:i w:val="0"/>
-                <w:color w:val="1E232D"/>
+                <w:color w:val="282828"/>
                 <w:sz w:val="20"/>
               </w:rPr>
-              <w:t>Manual-labor intensive workflows = exactly what robots need demonstrations of</w:t>
+              <w:t>Companies training robots or physical AI systems that need task-specific video data from Indian environments. Especially those with India deployment plans.</w:t>
             </w:r>
           </w:p>
         </w:tc>
@@ -264,7 +602,7 @@
         <w:tc>
           <w:tcPr>
             <w:tcW w:type="dxa" w:w="4703"/>
-            <w:shd w:val="clear" w:color="auto" w:fill="FFF4EE"/>
+            <w:shd w:val="clear" w:color="auto" w:fill="F0F7FF"/>
           </w:tcPr>
           <w:p>
             <w:r>
@@ -272,17 +610,17 @@
                 <w:rFonts w:ascii="Calibri" w:hAnsi="Calibri"/>
                 <w:b/>
                 <w:i w:val="0"/>
-                <w:color w:val="503C28"/>
+                <w:color w:val="1E3C78"/>
                 <w:sz w:val="20"/>
               </w:rPr>
-              <w:t>Why now</w:t>
+              <w:t>AI data buyers</w:t>
             </w:r>
           </w:p>
         </w:tc>
         <w:tc>
           <w:tcPr>
             <w:tcW w:type="dxa" w:w="4703"/>
-            <w:shd w:val="clear" w:color="auto" w:fill="FFF4EE"/>
+            <w:shd w:val="clear" w:color="auto" w:fill="F0F7FF"/>
           </w:tcPr>
           <w:p>
             <w:r>
@@ -290,10 +628,10 @@
                 <w:rFonts w:ascii="Calibri" w:hAnsi="Calibri"/>
                 <w:b w:val="0"/>
                 <w:i w:val="0"/>
-                <w:color w:val="1E232D"/>
+                <w:color w:val="282828"/>
                 <w:sz w:val="20"/>
               </w:rPr>
-              <w:t>Labs are moving from model research to data acquisition -- the buying wave is starting</w:t>
+              <w:t>Data engineering or research leads at AI companies actively acquiring egocentric or manipulation data for model training.</w:t>
             </w:r>
           </w:p>
         </w:tc>
@@ -301,272 +639,9 @@
     </w:tbl>
     <w:p>
       <w:pPr>
-        <w:spacing w:before="280" w:after="60"/>
-        <w:pBdr>
-          <w:bottom w:val="single" w:sz="4" w:space="1" w:color="E0E4EE"/>
-        </w:pBdr>
+        <w:spacing w:after="80"/>
       </w:pPr>
-      <w:r>
-        <w:rPr>
-          <w:rFonts w:ascii="Calibri" w:hAnsi="Calibri"/>
-          <w:b/>
-          <w:i w:val="0"/>
-          <w:color w:val="FF7A2F"/>
-          <w:sz w:val="17"/>
-        </w:rPr>
-        <w:t>TRACTION</w:t>
-      </w:r>
     </w:p>
-    <w:tbl>
-      <w:tblPr>
-        <w:tblStyle w:val="TableGrid"/>
-        <w:tblW w:type="auto" w:w="0"/>
-        <w:tblLook w:firstColumn="1" w:firstRow="1" w:lastColumn="0" w:lastRow="0" w:noHBand="0" w:noVBand="1" w:val="04A0"/>
-      </w:tblPr>
-      <w:tblGrid>
-        <w:gridCol w:w="4703"/>
-        <w:gridCol w:w="4703"/>
-      </w:tblGrid>
-      <w:tr>
-        <w:tc>
-          <w:tcPr>
-            <w:tcW w:type="dxa" w:w="4703"/>
-            <w:shd w:val="clear" w:color="auto" w:fill="F5F7FA"/>
-          </w:tcPr>
-          <w:p>
-            <w:r>
-              <w:rPr>
-                <w:rFonts w:ascii="Calibri" w:hAnsi="Calibri"/>
-                <w:b/>
-                <w:i w:val="0"/>
-                <w:color w:val="283C64"/>
-                <w:sz w:val="20"/>
-              </w:rPr>
-              <w:t>Active collections</w:t>
-            </w:r>
-          </w:p>
-        </w:tc>
-        <w:tc>
-          <w:tcPr>
-            <w:tcW w:type="dxa" w:w="4703"/>
-            <w:shd w:val="clear" w:color="auto" w:fill="F5F7FA"/>
-          </w:tcPr>
-          <w:p>
-            <w:r>
-              <w:rPr>
-                <w:rFonts w:ascii="Calibri" w:hAnsi="Calibri"/>
-                <w:b w:val="0"/>
-                <w:i w:val="0"/>
-                <w:color w:val="1E232D"/>
-                <w:sz w:val="20"/>
-              </w:rPr>
-              <w:t>Live egocentric data project, 1,000+ hours/month capacity</w:t>
-            </w:r>
-          </w:p>
-        </w:tc>
-      </w:tr>
-      <w:tr>
-        <w:tc>
-          <w:tcPr>
-            <w:tcW w:type="dxa" w:w="4703"/>
-            <w:shd w:val="clear" w:color="auto" w:fill="FFFFFF"/>
-          </w:tcPr>
-          <w:p>
-            <w:r>
-              <w:rPr>
-                <w:rFonts w:ascii="Calibri" w:hAnsi="Calibri"/>
-                <w:b/>
-                <w:i w:val="0"/>
-                <w:color w:val="283C64"/>
-                <w:sz w:val="20"/>
-              </w:rPr>
-              <w:t>Factory access</w:t>
-            </w:r>
-          </w:p>
-        </w:tc>
-        <w:tc>
-          <w:tcPr>
-            <w:tcW w:type="dxa" w:w="4703"/>
-            <w:shd w:val="clear" w:color="auto" w:fill="FFFFFF"/>
-          </w:tcPr>
-          <w:p>
-            <w:r>
-              <w:rPr>
-                <w:rFonts w:ascii="Calibri" w:hAnsi="Calibri"/>
-                <w:b w:val="0"/>
-                <w:i w:val="0"/>
-                <w:color w:val="1E232D"/>
-                <w:sz w:val="20"/>
-              </w:rPr>
-              <w:t>Manufacturing floor relationships across 3 verticals in India</w:t>
-            </w:r>
-          </w:p>
-        </w:tc>
-      </w:tr>
-      <w:tr>
-        <w:tc>
-          <w:tcPr>
-            <w:tcW w:type="dxa" w:w="4703"/>
-            <w:shd w:val="clear" w:color="auto" w:fill="F5F7FA"/>
-          </w:tcPr>
-          <w:p>
-            <w:r>
-              <w:rPr>
-                <w:rFonts w:ascii="Calibri" w:hAnsi="Calibri"/>
-                <w:b/>
-                <w:i w:val="0"/>
-                <w:color w:val="283C64"/>
-                <w:sz w:val="20"/>
-              </w:rPr>
-              <w:t>Agency pipeline</w:t>
-            </w:r>
-          </w:p>
-        </w:tc>
-        <w:tc>
-          <w:tcPr>
-            <w:tcW w:type="dxa" w:w="4703"/>
-            <w:shd w:val="clear" w:color="auto" w:fill="F5F7FA"/>
-          </w:tcPr>
-          <w:p>
-            <w:r>
-              <w:rPr>
-                <w:rFonts w:ascii="Calibri" w:hAnsi="Calibri"/>
-                <w:b w:val="0"/>
-                <w:i w:val="0"/>
-                <w:color w:val="1E232D"/>
-                <w:sz w:val="20"/>
-              </w:rPr>
-              <w:t>Active conversations with Tier 1/2 data agencies as sub-vendor</w:t>
-            </w:r>
-          </w:p>
-        </w:tc>
-      </w:tr>
-      <w:tr>
-        <w:tc>
-          <w:tcPr>
-            <w:tcW w:type="dxa" w:w="4703"/>
-            <w:shd w:val="clear" w:color="auto" w:fill="FFFFFF"/>
-          </w:tcPr>
-          <w:p>
-            <w:r>
-              <w:rPr>
-                <w:rFonts w:ascii="Calibri" w:hAnsi="Calibri"/>
-                <w:b/>
-                <w:i w:val="0"/>
-                <w:color w:val="283C64"/>
-                <w:sz w:val="20"/>
-              </w:rPr>
-              <w:t>Buyer conversations</w:t>
-            </w:r>
-          </w:p>
-        </w:tc>
-        <w:tc>
-          <w:tcPr>
-            <w:tcW w:type="dxa" w:w="4703"/>
-            <w:shd w:val="clear" w:color="auto" w:fill="FFFFFF"/>
-          </w:tcPr>
-          <w:p>
-            <w:r>
-              <w:rPr>
-                <w:rFonts w:ascii="Calibri" w:hAnsi="Calibri"/>
-                <w:b w:val="0"/>
-                <w:i w:val="0"/>
-                <w:color w:val="1E232D"/>
-                <w:sz w:val="20"/>
-              </w:rPr>
-              <w:t>Engaged with physical AI labs and robotics companies directly</w:t>
-            </w:r>
-          </w:p>
-        </w:tc>
-      </w:tr>
-    </w:tbl>
-    <w:p>
-      <w:pPr>
-        <w:spacing w:before="280" w:after="60"/>
-        <w:pBdr>
-          <w:bottom w:val="single" w:sz="4" w:space="1" w:color="E0E4EE"/>
-        </w:pBdr>
-      </w:pPr>
-      <w:r>
-        <w:rPr>
-          <w:rFonts w:ascii="Calibri" w:hAnsi="Calibri"/>
-          <w:b/>
-          <w:i w:val="0"/>
-          <w:color w:val="FF7A2F"/>
-          <w:sz w:val="17"/>
-        </w:rPr>
-        <w:t>WHO WE WANT TO MEET</w:t>
-      </w:r>
-    </w:p>
-    <w:p>
-      <w:pPr>
-        <w:pStyle w:val="ListBullet"/>
-        <w:spacing w:before="20" w:after="20"/>
-        <w:ind w:left="288"/>
-      </w:pPr>
-      <w:r>
-        <w:rPr>
-          <w:rFonts w:ascii="Calibri" w:hAnsi="Calibri"/>
-          <w:b w:val="0"/>
-          <w:i w:val="0"/>
-          <w:color w:val="1E232D"/>
-          <w:sz w:val="21"/>
-        </w:rPr>
-        <w:t>Robotics and embodied AI companies sourcing training data</w:t>
-      </w:r>
-    </w:p>
-    <w:p>
-      <w:pPr>
-        <w:pStyle w:val="ListBullet"/>
-        <w:spacing w:before="20" w:after="20"/>
-        <w:ind w:left="288"/>
-      </w:pPr>
-      <w:r>
-        <w:rPr>
-          <w:rFonts w:ascii="Calibri" w:hAnsi="Calibri"/>
-          <w:b w:val="0"/>
-          <w:i w:val="0"/>
-          <w:color w:val="1E232D"/>
-          <w:sz w:val="21"/>
-        </w:rPr>
-        <w:t>AI data platforms and dataset marketplaces</w:t>
-      </w:r>
-    </w:p>
-    <w:p>
-      <w:pPr>
-        <w:pStyle w:val="ListBullet"/>
-        <w:spacing w:before="20" w:after="20"/>
-        <w:ind w:left="288"/>
-      </w:pPr>
-      <w:r>
-        <w:rPr>
-          <w:rFonts w:ascii="Calibri" w:hAnsi="Calibri"/>
-          <w:b w:val="0"/>
-          <w:i w:val="0"/>
-          <w:color w:val="1E232D"/>
-          <w:sz w:val="21"/>
-        </w:rPr>
-        <w:t>Tier 1/2 data agencies looking for India sub-vendors</w:t>
-      </w:r>
-    </w:p>
-    <w:p>
-      <w:pPr>
-        <w:pStyle w:val="ListBullet"/>
-        <w:spacing w:before="20" w:after="20"/>
-        <w:ind w:left="288"/>
-      </w:pPr>
-      <w:r>
-        <w:rPr>
-          <w:rFonts w:ascii="Calibri" w:hAnsi="Calibri"/>
-          <w:b w:val="0"/>
-          <w:i w:val="0"/>
-          <w:color w:val="1E232D"/>
-          <w:sz w:val="21"/>
-        </w:rPr>
-        <w:t>Investors with portfolio companies in physical AI or manufacturing automation</w:t>
-      </w:r>
-    </w:p>
-    <w:p/>
     <w:p>
       <w:pPr>
         <w:spacing w:before="0" w:after="0"/>
@@ -582,12 +657,12 @@
       <w:r>
         <w:rPr>
           <w:rFonts w:ascii="Calibri" w:hAnsi="Calibri"/>
-          <w:b w:val="0"/>
+          <w:b/>
           <w:i w:val="0"/>
-          <w:color w:val="505A6E"/>
-          <w:sz w:val="20"/>
+          <w:color w:val="1E232D"/>
+          <w:sz w:val="21"/>
         </w:rPr>
-        <w:t xml:space="preserve">Srijan  --  </w:t>
+        <w:t xml:space="preserve">Srijan   </w:t>
       </w:r>
       <w:r>
         <w:rPr>
@@ -595,7 +670,7 @@
           <w:b w:val="0"/>
           <w:i w:val="0"/>
           <w:color w:val="FF7A2F"/>
-          <w:sz w:val="20"/>
+          <w:sz w:val="21"/>
         </w:rPr>
         <w:t>ldrago@0xqube.xyz</w:t>
       </w:r>
@@ -604,15 +679,15 @@
           <w:rFonts w:ascii="Calibri" w:hAnsi="Calibri"/>
           <w:b w:val="0"/>
           <w:i w:val="0"/>
-          <w:color w:val="505A6E"/>
-          <w:sz w:val="20"/>
+          <w:color w:val="6E788C"/>
+          <w:sz w:val="21"/>
         </w:rPr>
-        <w:t xml:space="preserve">  --  @Srijan0x</w:t>
+        <w:t xml:space="preserve">   @Srijan0x</w:t>
       </w:r>
     </w:p>
     <w:sectPr>
       <w:pgSz w:w="12240" w:h="15840"/>
-      <w:pgMar w:top="1134" w:right="1417" w:bottom="1134" w:left="1417" w:header="720" w:footer="720" w:gutter="0"/>
+      <w:pgMar w:top="1247" w:right="1417" w:bottom="1247" w:left="1417" w:header="720" w:footer="720" w:gutter="0"/>
       <w:cols w:space="720"/>
       <w:docGrid w:linePitch="360"/>
     </w:sectPr>

</xml_diff>